<commit_message>
Utökad sammanställning av ronder
</commit_message>
<xml_diff>
--- a/password.docx
+++ b/password.docx
@@ -15,10 +15,63 @@
         <w:t>Golftest123/</w:t>
       </w:r>
     </w:p>
+    <w:p>
+      <w:pPr>
+        <w:rPr>
+          <w:lang w:val="en-US"/>
+        </w:rPr>
+      </w:pPr>
+    </w:p>
+    <w:p>
+      <w:pPr>
+        <w:rPr>
+          <w:lang w:val="en-US"/>
+        </w:rPr>
+      </w:pPr>
+    </w:p>
+    <w:p>
+      <w:pPr>
+        <w:rPr>
+          <w:lang w:val="en-US"/>
+        </w:rPr>
+      </w:pPr>
+    </w:p>
+    <w:p>
+      <w:pPr>
+        <w:rPr>
+          <w:lang w:val="en-US"/>
+        </w:rPr>
+      </w:pPr>
+      <w:hyperlink r:id="rId7" w:history="1">
+        <w:r>
+          <w:rPr>
+            <w:rStyle w:val="Hyperlink"/>
+            <w:lang w:val="en-US"/>
+          </w:rPr>
+          <w:t>https://test-bmad-peter.vercel.app/login</w:t>
+        </w:r>
+      </w:hyperlink>
+    </w:p>
+    <w:p>
+      <w:pPr>
+        <w:rPr>
+          <w:lang w:val="en-US"/>
+        </w:rPr>
+      </w:pPr>
+      <w:r>
+        <w:rPr>
+          <w:lang w:val="en-US"/>
+        </w:rPr>
+        <w:t>https://vercel.com/peter-hellgren-s-projects/test-bmad-peter</w:t>
+      </w:r>
+    </w:p>
     <w:sectPr>
-      <w:headerReference w:type="even" r:id="rId6"/>
-      <w:headerReference w:type="default" r:id="rId7"/>
-      <w:headerReference w:type="first" r:id="rId8"/>
+      <w:headerReference w:type="even" r:id="rId8"/>
+      <w:headerReference w:type="default" r:id="rId9"/>
+      <w:footerReference w:type="even" r:id="rId10"/>
+      <w:footerReference w:type="default" r:id="rId11"/>
+      <w:headerReference w:type="first" r:id="rId12"/>
+      <w:footerReference w:type="first" r:id="rId13"/>
       <w:pgSz w:w="11906" w:h="16838"/>
       <w:pgMar w:top="1440" w:right="1440" w:bottom="1440" w:left="1440" w:header="708" w:footer="708" w:gutter="0"/>
       <w:cols w:space="708"/>
@@ -53,6 +106,417 @@
 </w:endnotes>
 </file>
 
+<file path=word/footer1.xml><?xml version="1.0" encoding="utf-8"?>
+<w:ftr xmlns:wpc="http://schemas.microsoft.com/office/word/2010/wordprocessingCanvas" xmlns:cx="http://schemas.microsoft.com/office/drawing/2014/chartex" xmlns:cx1="http://schemas.microsoft.com/office/drawing/2015/9/8/chartex" xmlns:cx2="http://schemas.microsoft.com/office/drawing/2015/10/21/chartex" xmlns:cx3="http://schemas.microsoft.com/office/drawing/2016/5/9/chartex" xmlns:cx4="http://schemas.microsoft.com/office/drawing/2016/5/10/chartex" xmlns:cx5="http://schemas.microsoft.com/office/drawing/2016/5/11/chartex" xmlns:cx6="http://schemas.microsoft.com/office/drawing/2016/5/12/chartex" xmlns:cx7="http://schemas.microsoft.com/office/drawing/2016/5/13/chartex" xmlns:cx8="http://schemas.microsoft.com/office/drawing/2016/5/14/chartex" xmlns:mc="http://schemas.openxmlformats.org/markup-compatibility/2006" xmlns:aink="http://schemas.microsoft.com/office/drawing/2016/ink" xmlns:am3d="http://schemas.microsoft.com/office/drawing/2017/model3d" xmlns:o="urn:schemas-microsoft-com:office:office" xmlns:oel="http://schemas.microsoft.com/office/2019/extlst" xmlns:r="http://schemas.openxmlformats.org/officeDocument/2006/relationships" xmlns:m="http://schemas.openxmlformats.org/officeDocument/2006/math" xmlns:v="urn:schemas-microsoft-com:vml" xmlns:wp14="http://schemas.microsoft.com/office/word/2010/wordprocessingDrawing" xmlns:wp="http://schemas.openxmlformats.org/drawingml/2006/wordprocessingDrawing" xmlns:w10="urn:schemas-microsoft-com:office:word" xmlns:w="http://schemas.openxmlformats.org/wordprocessingml/2006/main" xmlns:w14="http://schemas.microsoft.com/office/word/2010/wordml" xmlns:w15="http://schemas.microsoft.com/office/word/2012/wordml" xmlns:w16cex="http://schemas.microsoft.com/office/word/2018/wordml/cex" xmlns:w16cid="http://schemas.microsoft.com/office/word/2016/wordml/cid" xmlns:w16="http://schemas.microsoft.com/office/word/2018/wordml" xmlns:w16du="http://schemas.microsoft.com/office/word/2023/wordml/word16du" xmlns:w16sdtdh="http://schemas.microsoft.com/office/word/2020/wordml/sdtdatahash" xmlns:w16sdtfl="http://schemas.microsoft.com/office/word/2024/wordml/sdtformatlock" xmlns:w16se="http://schemas.microsoft.com/office/word/2015/wordml/symex" xmlns:wpg="http://schemas.microsoft.com/office/word/2010/wordprocessingGroup" xmlns:wpi="http://schemas.microsoft.com/office/word/2010/wordprocessingInk" xmlns:wne="http://schemas.microsoft.com/office/word/2006/wordml" xmlns:wps="http://schemas.microsoft.com/office/word/2010/wordprocessingShape" mc:Ignorable="w14 w15 w16se w16cid w16 w16cex w16sdtdh w16sdtfl w16du wp14">
+  <w:p>
+    <w:pPr>
+      <w:pStyle w:val="Footer"/>
+    </w:pPr>
+    <w:r>
+      <w:rPr>
+        <w:noProof/>
+      </w:rPr>
+      <mc:AlternateContent>
+        <mc:Choice Requires="wps">
+          <w:drawing>
+            <wp:anchor distT="0" distB="0" distL="0" distR="0" simplePos="0" relativeHeight="251658240" behindDoc="0" locked="0" layoutInCell="1" allowOverlap="1" wp14:anchorId="4A9673AF" wp14:editId="6B7937D0">
+              <wp:simplePos x="635" y="635"/>
+              <wp:positionH relativeFrom="page">
+                <wp:align>center</wp:align>
+              </wp:positionH>
+              <wp:positionV relativeFrom="page">
+                <wp:align>bottom</wp:align>
+              </wp:positionV>
+              <wp:extent cx="381635" cy="508000"/>
+              <wp:effectExtent l="0" t="0" r="18415" b="0"/>
+              <wp:wrapNone/>
+              <wp:docPr id="1860233486" name="Text Box 5" descr="Internal">
+                <a:extLst xmlns:a="http://schemas.openxmlformats.org/drawingml/2006/main">
+                  <a:ext uri="{5AE41FA2-C0FF-4470-9BD4-5FADCA87CBE2}">
+                    <aclsh:classification xmlns:aclsh="http://schemas.microsoft.com/office/drawing/2020/classificationShape" classificationOutcomeType="ftr"/>
+                  </a:ext>
+                </a:extLst>
+              </wp:docPr>
+              <wp:cNvGraphicFramePr/>
+              <a:graphic xmlns:a="http://schemas.openxmlformats.org/drawingml/2006/main">
+                <a:graphicData uri="http://schemas.microsoft.com/office/word/2010/wordprocessingShape">
+                  <wps:wsp>
+                    <wps:cNvSpPr txBox="1"/>
+                    <wps:spPr>
+                      <a:xfrm>
+                        <a:off x="0" y="0"/>
+                        <a:ext cx="381635" cy="508000"/>
+                      </a:xfrm>
+                      <a:prstGeom prst="rect">
+                        <a:avLst/>
+                      </a:prstGeom>
+                      <a:noFill/>
+                      <a:ln>
+                        <a:noFill/>
+                      </a:ln>
+                    </wps:spPr>
+                    <wps:txbx>
+                      <w:txbxContent>
+                        <w:p>
+                          <w:pPr>
+                            <w:spacing w:after="0"/>
+                            <w:rPr>
+                              <w:rFonts w:ascii="Arial" w:eastAsia="Arial" w:hAnsi="Arial" w:cs="Arial"/>
+                              <w:noProof/>
+                              <w:color w:val="000000"/>
+                              <w:sz w:val="18"/>
+                              <w:szCs w:val="18"/>
+                            </w:rPr>
+                          </w:pPr>
+                          <w:r>
+                            <w:rPr>
+                              <w:rFonts w:ascii="Arial" w:eastAsia="Arial" w:hAnsi="Arial" w:cs="Arial"/>
+                              <w:noProof/>
+                              <w:color w:val="000000"/>
+                              <w:sz w:val="18"/>
+                              <w:szCs w:val="18"/>
+                            </w:rPr>
+                            <w:t>Internal</w:t>
+                          </w:r>
+                        </w:p>
+                      </w:txbxContent>
+                    </wps:txbx>
+                    <wps:bodyPr rot="0" spcFirstLastPara="0" vertOverflow="overflow" horzOverflow="overflow" vert="horz" wrap="none" lIns="0" tIns="0" rIns="0" bIns="355600" numCol="1" spcCol="0" rtlCol="0" fromWordArt="0" anchor="b" anchorCtr="0" forceAA="0" compatLnSpc="1">
+                      <a:prstTxWarp prst="textNoShape">
+                        <a:avLst/>
+                      </a:prstTxWarp>
+                      <a:spAutoFit/>
+                    </wps:bodyPr>
+                  </wps:wsp>
+                </a:graphicData>
+              </a:graphic>
+              <wp14:sizeRelH relativeFrom="margin">
+                <wp14:pctWidth>0</wp14:pctWidth>
+              </wp14:sizeRelH>
+              <wp14:sizeRelV relativeFrom="margin">
+                <wp14:pctHeight>0</wp14:pctHeight>
+              </wp14:sizeRelV>
+            </wp:anchor>
+          </w:drawing>
+        </mc:Choice>
+        <mc:Fallback>
+          <w:pict>
+            <v:shapetype w14:anchorId="4A9673AF" id="_x0000_t202" coordsize="21600,21600" o:spt="202" path="m,l,21600r21600,l21600,xe">
+              <v:stroke joinstyle="miter"/>
+              <v:path gradientshapeok="t" o:connecttype="rect"/>
+            </v:shapetype>
+            <v:shape id="Text Box 5" o:spid="_x0000_s1026" type="#_x0000_t202" alt="Internal" style="position:absolute;margin-left:0;margin-top:0;width:30.05pt;height:40pt;z-index:251658240;visibility:visible;mso-wrap-style:none;mso-width-percent:0;mso-height-percent:0;mso-wrap-distance-left:0;mso-wrap-distance-top:0;mso-wrap-distance-right:0;mso-wrap-distance-bottom:0;mso-position-horizontal:center;mso-position-horizontal-relative:page;mso-position-vertical:bottom;mso-position-vertical-relative:page;mso-width-percent:0;mso-height-percent:0;mso-width-relative:margin;mso-height-relative:margin;v-text-anchor:bottom" o:gfxdata="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" filled="f" stroked="f">
+              <v:fill o:detectmouseclick="t"/>
+              <v:textbox style="mso-fit-shape-to-text:t" inset="0,0,0,28pt">
+                <w:txbxContent>
+                  <w:p>
+                    <w:pPr>
+                      <w:spacing w:after="0"/>
+                      <w:rPr>
+                        <w:rFonts w:ascii="Arial" w:eastAsia="Arial" w:hAnsi="Arial" w:cs="Arial"/>
+                        <w:noProof/>
+                        <w:color w:val="000000"/>
+                        <w:sz w:val="18"/>
+                        <w:szCs w:val="18"/>
+                      </w:rPr>
+                    </w:pPr>
+                    <w:r>
+                      <w:rPr>
+                        <w:rFonts w:ascii="Arial" w:eastAsia="Arial" w:hAnsi="Arial" w:cs="Arial"/>
+                        <w:noProof/>
+                        <w:color w:val="000000"/>
+                        <w:sz w:val="18"/>
+                        <w:szCs w:val="18"/>
+                      </w:rPr>
+                      <w:t>Internal</w:t>
+                    </w:r>
+                  </w:p>
+                </w:txbxContent>
+              </v:textbox>
+              <w10:wrap anchorx="page" anchory="page"/>
+            </v:shape>
+          </w:pict>
+        </mc:Fallback>
+      </mc:AlternateContent>
+    </w:r>
+  </w:p>
+</w:ftr>
+</file>
+
+<file path=word/footer2.xml><?xml version="1.0" encoding="utf-8"?>
+<w:ftr xmlns:wpc="http://schemas.microsoft.com/office/word/2010/wordprocessingCanvas" xmlns:cx="http://schemas.microsoft.com/office/drawing/2014/chartex" xmlns:cx1="http://schemas.microsoft.com/office/drawing/2015/9/8/chartex" xmlns:cx2="http://schemas.microsoft.com/office/drawing/2015/10/21/chartex" xmlns:cx3="http://schemas.microsoft.com/office/drawing/2016/5/9/chartex" xmlns:cx4="http://schemas.microsoft.com/office/drawing/2016/5/10/chartex" xmlns:cx5="http://schemas.microsoft.com/office/drawing/2016/5/11/chartex" xmlns:cx6="http://schemas.microsoft.com/office/drawing/2016/5/12/chartex" xmlns:cx7="http://schemas.microsoft.com/office/drawing/2016/5/13/chartex" xmlns:cx8="http://schemas.microsoft.com/office/drawing/2016/5/14/chartex" xmlns:mc="http://schemas.openxmlformats.org/markup-compatibility/2006" xmlns:aink="http://schemas.microsoft.com/office/drawing/2016/ink" xmlns:am3d="http://schemas.microsoft.com/office/drawing/2017/model3d" xmlns:o="urn:schemas-microsoft-com:office:office" xmlns:oel="http://schemas.microsoft.com/office/2019/extlst" xmlns:r="http://schemas.openxmlformats.org/officeDocument/2006/relationships" xmlns:m="http://schemas.openxmlformats.org/officeDocument/2006/math" xmlns:v="urn:schemas-microsoft-com:vml" xmlns:wp14="http://schemas.microsoft.com/office/word/2010/wordprocessingDrawing" xmlns:wp="http://schemas.openxmlformats.org/drawingml/2006/wordprocessingDrawing" xmlns:w10="urn:schemas-microsoft-com:office:word" xmlns:w="http://schemas.openxmlformats.org/wordprocessingml/2006/main" xmlns:w14="http://schemas.microsoft.com/office/word/2010/wordml" xmlns:w15="http://schemas.microsoft.com/office/word/2012/wordml" xmlns:w16cex="http://schemas.microsoft.com/office/word/2018/wordml/cex" xmlns:w16cid="http://schemas.microsoft.com/office/word/2016/wordml/cid" xmlns:w16="http://schemas.microsoft.com/office/word/2018/wordml" xmlns:w16du="http://schemas.microsoft.com/office/word/2023/wordml/word16du" xmlns:w16sdtdh="http://schemas.microsoft.com/office/word/2020/wordml/sdtdatahash" xmlns:w16sdtfl="http://schemas.microsoft.com/office/word/2024/wordml/sdtformatlock" xmlns:w16se="http://schemas.microsoft.com/office/word/2015/wordml/symex" xmlns:wpg="http://schemas.microsoft.com/office/word/2010/wordprocessingGroup" xmlns:wpi="http://schemas.microsoft.com/office/word/2010/wordprocessingInk" xmlns:wne="http://schemas.microsoft.com/office/word/2006/wordml" xmlns:wps="http://schemas.microsoft.com/office/word/2010/wordprocessingShape" mc:Ignorable="w14 w15 w16se w16cid w16 w16cex w16sdtdh w16sdtfl w16du wp14">
+  <w:p>
+    <w:pPr>
+      <w:pStyle w:val="Footer"/>
+    </w:pPr>
+    <w:r>
+      <w:rPr>
+        <w:noProof/>
+      </w:rPr>
+      <mc:AlternateContent>
+        <mc:Choice Requires="wps">
+          <w:drawing>
+            <wp:anchor distT="0" distB="0" distL="0" distR="0" simplePos="0" relativeHeight="251658241" behindDoc="0" locked="0" layoutInCell="1" allowOverlap="1" wp14:anchorId="68D3CA2A" wp14:editId="24C0FE4F">
+              <wp:simplePos x="914400" y="10058400"/>
+              <wp:positionH relativeFrom="page">
+                <wp:align>center</wp:align>
+              </wp:positionH>
+              <wp:positionV relativeFrom="page">
+                <wp:align>bottom</wp:align>
+              </wp:positionV>
+              <wp:extent cx="381635" cy="508000"/>
+              <wp:effectExtent l="0" t="0" r="18415" b="0"/>
+              <wp:wrapNone/>
+              <wp:docPr id="1533570507" name="Text Box 6" descr="Internal">
+                <a:extLst xmlns:a="http://schemas.openxmlformats.org/drawingml/2006/main">
+                  <a:ext uri="{5AE41FA2-C0FF-4470-9BD4-5FADCA87CBE2}">
+                    <aclsh:classification xmlns:aclsh="http://schemas.microsoft.com/office/drawing/2020/classificationShape" classificationOutcomeType="ftr"/>
+                  </a:ext>
+                </a:extLst>
+              </wp:docPr>
+              <wp:cNvGraphicFramePr/>
+              <a:graphic xmlns:a="http://schemas.openxmlformats.org/drawingml/2006/main">
+                <a:graphicData uri="http://schemas.microsoft.com/office/word/2010/wordprocessingShape">
+                  <wps:wsp>
+                    <wps:cNvSpPr txBox="1"/>
+                    <wps:spPr>
+                      <a:xfrm>
+                        <a:off x="0" y="0"/>
+                        <a:ext cx="381635" cy="508000"/>
+                      </a:xfrm>
+                      <a:prstGeom prst="rect">
+                        <a:avLst/>
+                      </a:prstGeom>
+                      <a:noFill/>
+                      <a:ln>
+                        <a:noFill/>
+                      </a:ln>
+                    </wps:spPr>
+                    <wps:txbx>
+                      <w:txbxContent>
+                        <w:p>
+                          <w:pPr>
+                            <w:spacing w:after="0"/>
+                            <w:rPr>
+                              <w:rFonts w:ascii="Arial" w:eastAsia="Arial" w:hAnsi="Arial" w:cs="Arial"/>
+                              <w:noProof/>
+                              <w:color w:val="000000"/>
+                              <w:sz w:val="18"/>
+                              <w:szCs w:val="18"/>
+                            </w:rPr>
+                          </w:pPr>
+                          <w:r>
+                            <w:rPr>
+                              <w:rFonts w:ascii="Arial" w:eastAsia="Arial" w:hAnsi="Arial" w:cs="Arial"/>
+                              <w:noProof/>
+                              <w:color w:val="000000"/>
+                              <w:sz w:val="18"/>
+                              <w:szCs w:val="18"/>
+                            </w:rPr>
+                            <w:t>Internal</w:t>
+                          </w:r>
+                        </w:p>
+                      </w:txbxContent>
+                    </wps:txbx>
+                    <wps:bodyPr rot="0" spcFirstLastPara="0" vertOverflow="overflow" horzOverflow="overflow" vert="horz" wrap="none" lIns="0" tIns="0" rIns="0" bIns="355600" numCol="1" spcCol="0" rtlCol="0" fromWordArt="0" anchor="b" anchorCtr="0" forceAA="0" compatLnSpc="1">
+                      <a:prstTxWarp prst="textNoShape">
+                        <a:avLst/>
+                      </a:prstTxWarp>
+                      <a:spAutoFit/>
+                    </wps:bodyPr>
+                  </wps:wsp>
+                </a:graphicData>
+              </a:graphic>
+              <wp14:sizeRelH relativeFrom="margin">
+                <wp14:pctWidth>0</wp14:pctWidth>
+              </wp14:sizeRelH>
+              <wp14:sizeRelV relativeFrom="margin">
+                <wp14:pctHeight>0</wp14:pctHeight>
+              </wp14:sizeRelV>
+            </wp:anchor>
+          </w:drawing>
+        </mc:Choice>
+        <mc:Fallback>
+          <w:pict>
+            <v:shapetype w14:anchorId="68D3CA2A" id="_x0000_t202" coordsize="21600,21600" o:spt="202" path="m,l,21600r21600,l21600,xe">
+              <v:stroke joinstyle="miter"/>
+              <v:path gradientshapeok="t" o:connecttype="rect"/>
+            </v:shapetype>
+            <v:shape id="Text Box 6" o:spid="_x0000_s1027" type="#_x0000_t202" alt="Internal" style="position:absolute;margin-left:0;margin-top:0;width:30.05pt;height:40pt;z-index:251658241;visibility:visible;mso-wrap-style:none;mso-width-percent:0;mso-height-percent:0;mso-wrap-distance-left:0;mso-wrap-distance-top:0;mso-wrap-distance-right:0;mso-wrap-distance-bottom:0;mso-position-horizontal:center;mso-position-horizontal-relative:page;mso-position-vertical:bottom;mso-position-vertical-relative:page;mso-width-percent:0;mso-height-percent:0;mso-width-relative:margin;mso-height-relative:margin;v-text-anchor:bottom" o:gfxdata="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" filled="f" stroked="f">
+              <v:fill o:detectmouseclick="t"/>
+              <v:textbox style="mso-fit-shape-to-text:t" inset="0,0,0,28pt">
+                <w:txbxContent>
+                  <w:p>
+                    <w:pPr>
+                      <w:spacing w:after="0"/>
+                      <w:rPr>
+                        <w:rFonts w:ascii="Arial" w:eastAsia="Arial" w:hAnsi="Arial" w:cs="Arial"/>
+                        <w:noProof/>
+                        <w:color w:val="000000"/>
+                        <w:sz w:val="18"/>
+                        <w:szCs w:val="18"/>
+                      </w:rPr>
+                    </w:pPr>
+                    <w:r>
+                      <w:rPr>
+                        <w:rFonts w:ascii="Arial" w:eastAsia="Arial" w:hAnsi="Arial" w:cs="Arial"/>
+                        <w:noProof/>
+                        <w:color w:val="000000"/>
+                        <w:sz w:val="18"/>
+                        <w:szCs w:val="18"/>
+                      </w:rPr>
+                      <w:t>Internal</w:t>
+                    </w:r>
+                  </w:p>
+                </w:txbxContent>
+              </v:textbox>
+              <w10:wrap anchorx="page" anchory="page"/>
+            </v:shape>
+          </w:pict>
+        </mc:Fallback>
+      </mc:AlternateContent>
+    </w:r>
+  </w:p>
+</w:ftr>
+</file>
+
+<file path=word/footer3.xml><?xml version="1.0" encoding="utf-8"?>
+<w:ftr xmlns:wpc="http://schemas.microsoft.com/office/word/2010/wordprocessingCanvas" xmlns:cx="http://schemas.microsoft.com/office/drawing/2014/chartex" xmlns:cx1="http://schemas.microsoft.com/office/drawing/2015/9/8/chartex" xmlns:cx2="http://schemas.microsoft.com/office/drawing/2015/10/21/chartex" xmlns:cx3="http://schemas.microsoft.com/office/drawing/2016/5/9/chartex" xmlns:cx4="http://schemas.microsoft.com/office/drawing/2016/5/10/chartex" xmlns:cx5="http://schemas.microsoft.com/office/drawing/2016/5/11/chartex" xmlns:cx6="http://schemas.microsoft.com/office/drawing/2016/5/12/chartex" xmlns:cx7="http://schemas.microsoft.com/office/drawing/2016/5/13/chartex" xmlns:cx8="http://schemas.microsoft.com/office/drawing/2016/5/14/chartex" xmlns:mc="http://schemas.openxmlformats.org/markup-compatibility/2006" xmlns:aink="http://schemas.microsoft.com/office/drawing/2016/ink" xmlns:am3d="http://schemas.microsoft.com/office/drawing/2017/model3d" xmlns:o="urn:schemas-microsoft-com:office:office" xmlns:oel="http://schemas.microsoft.com/office/2019/extlst" xmlns:r="http://schemas.openxmlformats.org/officeDocument/2006/relationships" xmlns:m="http://schemas.openxmlformats.org/officeDocument/2006/math" xmlns:v="urn:schemas-microsoft-com:vml" xmlns:wp14="http://schemas.microsoft.com/office/word/2010/wordprocessingDrawing" xmlns:wp="http://schemas.openxmlformats.org/drawingml/2006/wordprocessingDrawing" xmlns:w10="urn:schemas-microsoft-com:office:word" xmlns:w="http://schemas.openxmlformats.org/wordprocessingml/2006/main" xmlns:w14="http://schemas.microsoft.com/office/word/2010/wordml" xmlns:w15="http://schemas.microsoft.com/office/word/2012/wordml" xmlns:w16cex="http://schemas.microsoft.com/office/word/2018/wordml/cex" xmlns:w16cid="http://schemas.microsoft.com/office/word/2016/wordml/cid" xmlns:w16="http://schemas.microsoft.com/office/word/2018/wordml" xmlns:w16du="http://schemas.microsoft.com/office/word/2023/wordml/word16du" xmlns:w16sdtdh="http://schemas.microsoft.com/office/word/2020/wordml/sdtdatahash" xmlns:w16sdtfl="http://schemas.microsoft.com/office/word/2024/wordml/sdtformatlock" xmlns:w16se="http://schemas.microsoft.com/office/word/2015/wordml/symex" xmlns:wpg="http://schemas.microsoft.com/office/word/2010/wordprocessingGroup" xmlns:wpi="http://schemas.microsoft.com/office/word/2010/wordprocessingInk" xmlns:wne="http://schemas.microsoft.com/office/word/2006/wordml" xmlns:wps="http://schemas.microsoft.com/office/word/2010/wordprocessingShape" mc:Ignorable="w14 w15 w16se w16cid w16 w16cex w16sdtdh w16sdtfl w16du wp14">
+  <w:p>
+    <w:pPr>
+      <w:pStyle w:val="Footer"/>
+    </w:pPr>
+    <w:r>
+      <w:rPr>
+        <w:noProof/>
+      </w:rPr>
+      <mc:AlternateContent>
+        <mc:Choice Requires="wps">
+          <w:drawing>
+            <wp:anchor distT="0" distB="0" distL="0" distR="0" simplePos="0" relativeHeight="251658242" behindDoc="0" locked="0" layoutInCell="1" allowOverlap="1" wp14:anchorId="16CF5317" wp14:editId="09FD564E">
+              <wp:simplePos x="635" y="635"/>
+              <wp:positionH relativeFrom="page">
+                <wp:align>center</wp:align>
+              </wp:positionH>
+              <wp:positionV relativeFrom="page">
+                <wp:align>bottom</wp:align>
+              </wp:positionV>
+              <wp:extent cx="381635" cy="508000"/>
+              <wp:effectExtent l="0" t="0" r="18415" b="0"/>
+              <wp:wrapNone/>
+              <wp:docPr id="357348849" name="Text Box 4" descr="Internal">
+                <a:extLst xmlns:a="http://schemas.openxmlformats.org/drawingml/2006/main">
+                  <a:ext uri="{5AE41FA2-C0FF-4470-9BD4-5FADCA87CBE2}">
+                    <aclsh:classification xmlns:aclsh="http://schemas.microsoft.com/office/drawing/2020/classificationShape" classificationOutcomeType="ftr"/>
+                  </a:ext>
+                </a:extLst>
+              </wp:docPr>
+              <wp:cNvGraphicFramePr/>
+              <a:graphic xmlns:a="http://schemas.openxmlformats.org/drawingml/2006/main">
+                <a:graphicData uri="http://schemas.microsoft.com/office/word/2010/wordprocessingShape">
+                  <wps:wsp>
+                    <wps:cNvSpPr txBox="1"/>
+                    <wps:spPr>
+                      <a:xfrm>
+                        <a:off x="0" y="0"/>
+                        <a:ext cx="381635" cy="508000"/>
+                      </a:xfrm>
+                      <a:prstGeom prst="rect">
+                        <a:avLst/>
+                      </a:prstGeom>
+                      <a:noFill/>
+                      <a:ln>
+                        <a:noFill/>
+                      </a:ln>
+                    </wps:spPr>
+                    <wps:txbx>
+                      <w:txbxContent>
+                        <w:p>
+                          <w:pPr>
+                            <w:spacing w:after="0"/>
+                            <w:rPr>
+                              <w:rFonts w:ascii="Arial" w:eastAsia="Arial" w:hAnsi="Arial" w:cs="Arial"/>
+                              <w:noProof/>
+                              <w:color w:val="000000"/>
+                              <w:sz w:val="18"/>
+                              <w:szCs w:val="18"/>
+                            </w:rPr>
+                          </w:pPr>
+                          <w:r>
+                            <w:rPr>
+                              <w:rFonts w:ascii="Arial" w:eastAsia="Arial" w:hAnsi="Arial" w:cs="Arial"/>
+                              <w:noProof/>
+                              <w:color w:val="000000"/>
+                              <w:sz w:val="18"/>
+                              <w:szCs w:val="18"/>
+                            </w:rPr>
+                            <w:t>Internal</w:t>
+                          </w:r>
+                        </w:p>
+                      </w:txbxContent>
+                    </wps:txbx>
+                    <wps:bodyPr rot="0" spcFirstLastPara="0" vertOverflow="overflow" horzOverflow="overflow" vert="horz" wrap="none" lIns="0" tIns="0" rIns="0" bIns="355600" numCol="1" spcCol="0" rtlCol="0" fromWordArt="0" anchor="b" anchorCtr="0" forceAA="0" compatLnSpc="1">
+                      <a:prstTxWarp prst="textNoShape">
+                        <a:avLst/>
+                      </a:prstTxWarp>
+                      <a:spAutoFit/>
+                    </wps:bodyPr>
+                  </wps:wsp>
+                </a:graphicData>
+              </a:graphic>
+              <wp14:sizeRelH relativeFrom="margin">
+                <wp14:pctWidth>0</wp14:pctWidth>
+              </wp14:sizeRelH>
+              <wp14:sizeRelV relativeFrom="margin">
+                <wp14:pctHeight>0</wp14:pctHeight>
+              </wp14:sizeRelV>
+            </wp:anchor>
+          </w:drawing>
+        </mc:Choice>
+        <mc:Fallback>
+          <w:pict>
+            <v:shapetype w14:anchorId="16CF5317" id="_x0000_t202" coordsize="21600,21600" o:spt="202" path="m,l,21600r21600,l21600,xe">
+              <v:stroke joinstyle="miter"/>
+              <v:path gradientshapeok="t" o:connecttype="rect"/>
+            </v:shapetype>
+            <v:shape id="Text Box 4" o:spid="_x0000_s1028" type="#_x0000_t202" alt="Internal" style="position:absolute;margin-left:0;margin-top:0;width:30.05pt;height:40pt;z-index:251658242;visibility:visible;mso-wrap-style:none;mso-width-percent:0;mso-height-percent:0;mso-wrap-distance-left:0;mso-wrap-distance-top:0;mso-wrap-distance-right:0;mso-wrap-distance-bottom:0;mso-position-horizontal:center;mso-position-horizontal-relative:page;mso-position-vertical:bottom;mso-position-vertical-relative:page;mso-width-percent:0;mso-height-percent:0;mso-width-relative:margin;mso-height-relative:margin;v-text-anchor:bottom" o:gfxdata="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" filled="f" stroked="f">
+              <v:fill o:detectmouseclick="t"/>
+              <v:textbox style="mso-fit-shape-to-text:t" inset="0,0,0,28pt">
+                <w:txbxContent>
+                  <w:p>
+                    <w:pPr>
+                      <w:spacing w:after="0"/>
+                      <w:rPr>
+                        <w:rFonts w:ascii="Arial" w:eastAsia="Arial" w:hAnsi="Arial" w:cs="Arial"/>
+                        <w:noProof/>
+                        <w:color w:val="000000"/>
+                        <w:sz w:val="18"/>
+                        <w:szCs w:val="18"/>
+                      </w:rPr>
+                    </w:pPr>
+                    <w:r>
+                      <w:rPr>
+                        <w:rFonts w:ascii="Arial" w:eastAsia="Arial" w:hAnsi="Arial" w:cs="Arial"/>
+                        <w:noProof/>
+                        <w:color w:val="000000"/>
+                        <w:sz w:val="18"/>
+                        <w:szCs w:val="18"/>
+                      </w:rPr>
+                      <w:t>Internal</w:t>
+                    </w:r>
+                  </w:p>
+                </w:txbxContent>
+              </v:textbox>
+              <w10:wrap anchorx="page" anchory="page"/>
+            </v:shape>
+          </w:pict>
+        </mc:Fallback>
+      </mc:AlternateContent>
+    </w:r>
+  </w:p>
+</w:ftr>
+</file>
+
 <file path=word/footnotes.xml><?xml version="1.0" encoding="utf-8"?>
 <w:footnotes xmlns:wpc="http://schemas.microsoft.com/office/word/2010/wordprocessingCanvas" xmlns:cx="http://schemas.microsoft.com/office/drawing/2014/chartex" xmlns:cx1="http://schemas.microsoft.com/office/drawing/2015/9/8/chartex" xmlns:cx2="http://schemas.microsoft.com/office/drawing/2015/10/21/chartex" xmlns:cx3="http://schemas.microsoft.com/office/drawing/2016/5/9/chartex" xmlns:cx4="http://schemas.microsoft.com/office/drawing/2016/5/10/chartex" xmlns:cx5="http://schemas.microsoft.com/office/drawing/2016/5/11/chartex" xmlns:cx6="http://schemas.microsoft.com/office/drawing/2016/5/12/chartex" xmlns:cx7="http://schemas.microsoft.com/office/drawing/2016/5/13/chartex" xmlns:cx8="http://schemas.microsoft.com/office/drawing/2016/5/14/chartex" xmlns:mc="http://schemas.openxmlformats.org/markup-compatibility/2006" xmlns:aink="http://schemas.microsoft.com/office/drawing/2016/ink" xmlns:am3d="http://schemas.microsoft.com/office/drawing/2017/model3d" xmlns:o="urn:schemas-microsoft-com:office:office" xmlns:oel="http://schemas.microsoft.com/office/2019/extlst" xmlns:r="http://schemas.openxmlformats.org/officeDocument/2006/relationships" xmlns:m="http://schemas.openxmlformats.org/officeDocument/2006/math" xmlns:v="urn:schemas-microsoft-com:vml" xmlns:wp14="http://schemas.microsoft.com/office/word/2010/wordprocessingDrawing" xmlns:wp="http://schemas.openxmlformats.org/drawingml/2006/wordprocessingDrawing" xmlns:w10="urn:schemas-microsoft-com:office:word" xmlns:w="http://schemas.openxmlformats.org/wordprocessingml/2006/main" xmlns:w14="http://schemas.microsoft.com/office/word/2010/wordml" xmlns:w15="http://schemas.microsoft.com/office/word/2012/wordml" xmlns:w16cex="http://schemas.microsoft.com/office/word/2018/wordml/cex" xmlns:w16cid="http://schemas.microsoft.com/office/word/2016/wordml/cid" xmlns:w16="http://schemas.microsoft.com/office/word/2018/wordml" xmlns:w16du="http://schemas.microsoft.com/office/word/2023/wordml/word16du" xmlns:w16sdtdh="http://schemas.microsoft.com/office/word/2020/wordml/sdtdatahash" xmlns:w16sdtfl="http://schemas.microsoft.com/office/word/2024/wordml/sdtformatlock" xmlns:w16se="http://schemas.microsoft.com/office/word/2015/wordml/symex" xmlns:wpg="http://schemas.microsoft.com/office/word/2010/wordprocessingGroup" xmlns:wpi="http://schemas.microsoft.com/office/word/2010/wordprocessingInk" xmlns:wne="http://schemas.microsoft.com/office/word/2006/wordml" xmlns:wps="http://schemas.microsoft.com/office/word/2010/wordprocessingShape" mc:Ignorable="w14 w15 w16se w16cid w16 w16cex w16sdtdh w16sdtfl w16du wp14">
   <w:footnote w:type="separator" w:id="-1">
@@ -84,127 +548,6 @@
     <w:pPr>
       <w:pStyle w:val="Header"/>
     </w:pPr>
-    <w:r>
-      <w:rPr>
-        <w:noProof/>
-      </w:rPr>
-      <mc:AlternateContent>
-        <mc:Choice Requires="wps">
-          <w:drawing>
-            <wp:anchor distT="0" distB="0" distL="0" distR="0" simplePos="0" relativeHeight="251659264" behindDoc="0" locked="0" layoutInCell="1" allowOverlap="1" wp14:anchorId="30995685" wp14:editId="6ED38CD4">
-              <wp:simplePos x="635" y="635"/>
-              <wp:positionH relativeFrom="page">
-                <wp:align>left</wp:align>
-              </wp:positionH>
-              <wp:positionV relativeFrom="page">
-                <wp:align>top</wp:align>
-              </wp:positionV>
-              <wp:extent cx="282575" cy="325755"/>
-              <wp:effectExtent l="0" t="0" r="3175" b="17145"/>
-              <wp:wrapNone/>
-              <wp:docPr id="684277052" name="Text Box 2" descr=" ">
-                <a:extLst xmlns:a="http://schemas.openxmlformats.org/drawingml/2006/main">
-                  <a:ext uri="{5AE41FA2-C0FF-4470-9BD4-5FADCA87CBE2}">
-                    <aclsh:classification xmlns:aclsh="http://schemas.microsoft.com/office/drawing/2020/classificationShape" classificationOutcomeType="hdr"/>
-                  </a:ext>
-                </a:extLst>
-              </wp:docPr>
-              <wp:cNvGraphicFramePr/>
-              <a:graphic xmlns:a="http://schemas.openxmlformats.org/drawingml/2006/main">
-                <a:graphicData uri="http://schemas.microsoft.com/office/word/2010/wordprocessingShape">
-                  <wps:wsp>
-                    <wps:cNvSpPr txBox="1"/>
-                    <wps:spPr>
-                      <a:xfrm>
-                        <a:off x="0" y="0"/>
-                        <a:ext cx="282575" cy="325755"/>
-                      </a:xfrm>
-                      <a:prstGeom prst="rect">
-                        <a:avLst/>
-                      </a:prstGeom>
-                      <a:noFill/>
-                      <a:ln>
-                        <a:noFill/>
-                      </a:ln>
-                    </wps:spPr>
-                    <wps:txbx>
-                      <w:txbxContent>
-                        <w:p>
-                          <w:pPr>
-                            <w:spacing w:after="0"/>
-                            <w:rPr>
-                              <w:rFonts w:ascii="Arial" w:eastAsia="Arial" w:hAnsi="Arial" w:cs="Arial"/>
-                              <w:noProof/>
-                              <w:color w:val="000000"/>
-                              <w:sz w:val="16"/>
-                              <w:szCs w:val="16"/>
-                            </w:rPr>
-                          </w:pPr>
-                          <w:r>
-                            <w:rPr>
-                              <w:rFonts w:ascii="Arial" w:eastAsia="Arial" w:hAnsi="Arial" w:cs="Arial"/>
-                              <w:noProof/>
-                              <w:color w:val="000000"/>
-                              <w:sz w:val="16"/>
-                              <w:szCs w:val="16"/>
-                            </w:rPr>
-                            <w:t xml:space="preserve"> </w:t>
-                          </w:r>
-                        </w:p>
-                      </w:txbxContent>
-                    </wps:txbx>
-                    <wps:bodyPr rot="0" spcFirstLastPara="0" vertOverflow="overflow" horzOverflow="overflow" vert="horz" wrap="none" lIns="254000" tIns="190500" rIns="0" bIns="0" numCol="1" spcCol="0" rtlCol="0" fromWordArt="0" anchor="t" anchorCtr="0" forceAA="0" compatLnSpc="1">
-                      <a:prstTxWarp prst="textNoShape">
-                        <a:avLst/>
-                      </a:prstTxWarp>
-                      <a:spAutoFit/>
-                    </wps:bodyPr>
-                  </wps:wsp>
-                </a:graphicData>
-              </a:graphic>
-            </wp:anchor>
-          </w:drawing>
-        </mc:Choice>
-        <mc:Fallback>
-          <w:pict>
-            <v:shapetype w14:anchorId="30995685" id="_x0000_t202" coordsize="21600,21600" o:spt="202" path="m,l,21600r21600,l21600,xe">
-              <v:stroke joinstyle="miter"/>
-              <v:path gradientshapeok="t" o:connecttype="rect"/>
-            </v:shapetype>
-            <v:shape id="Text Box 2" o:spid="_x0000_s1026" type="#_x0000_t202" alt=" " style="position:absolute;margin-left:0;margin-top:0;width:22.25pt;height:25.65pt;z-index:251659264;visibility:visible;mso-wrap-style:none;mso-wrap-distance-left:0;mso-wrap-distance-top:0;mso-wrap-distance-right:0;mso-wrap-distance-bottom:0;mso-position-horizontal:left;mso-position-horizontal-relative:page;mso-position-vertical:top;mso-position-vertical-relative:page;v-text-anchor:top" o:gfxdata="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" filled="f" stroked="f">
-              <v:fill o:detectmouseclick="t"/>
-              <v:textbox style="mso-fit-shape-to-text:t" inset="20pt,15pt,0,0">
-                <w:txbxContent>
-                  <w:p>
-                    <w:pPr>
-                      <w:spacing w:after="0"/>
-                      <w:rPr>
-                        <w:rFonts w:ascii="Arial" w:eastAsia="Arial" w:hAnsi="Arial" w:cs="Arial"/>
-                        <w:noProof/>
-                        <w:color w:val="000000"/>
-                        <w:sz w:val="16"/>
-                        <w:szCs w:val="16"/>
-                      </w:rPr>
-                    </w:pPr>
-                    <w:r>
-                      <w:rPr>
-                        <w:rFonts w:ascii="Arial" w:eastAsia="Arial" w:hAnsi="Arial" w:cs="Arial"/>
-                        <w:noProof/>
-                        <w:color w:val="000000"/>
-                        <w:sz w:val="16"/>
-                        <w:szCs w:val="16"/>
-                      </w:rPr>
-                      <w:t xml:space="preserve"> </w:t>
-                    </w:r>
-                  </w:p>
-                </w:txbxContent>
-              </v:textbox>
-              <w10:wrap anchorx="page" anchory="page"/>
-            </v:shape>
-          </w:pict>
-        </mc:Fallback>
-      </mc:AlternateContent>
-    </w:r>
   </w:p>
 </w:hdr>
 </file>
@@ -215,127 +558,6 @@
     <w:pPr>
       <w:pStyle w:val="Header"/>
     </w:pPr>
-    <w:r>
-      <w:rPr>
-        <w:noProof/>
-      </w:rPr>
-      <mc:AlternateContent>
-        <mc:Choice Requires="wps">
-          <w:drawing>
-            <wp:anchor distT="0" distB="0" distL="0" distR="0" simplePos="0" relativeHeight="251660288" behindDoc="0" locked="0" layoutInCell="1" allowOverlap="1" wp14:anchorId="4DD21ED1" wp14:editId="32E55F30">
-              <wp:simplePos x="914400" y="450850"/>
-              <wp:positionH relativeFrom="page">
-                <wp:align>left</wp:align>
-              </wp:positionH>
-              <wp:positionV relativeFrom="page">
-                <wp:align>top</wp:align>
-              </wp:positionV>
-              <wp:extent cx="282575" cy="325755"/>
-              <wp:effectExtent l="0" t="0" r="3175" b="17145"/>
-              <wp:wrapNone/>
-              <wp:docPr id="751332896" name="Text Box 3" descr=" ">
-                <a:extLst xmlns:a="http://schemas.openxmlformats.org/drawingml/2006/main">
-                  <a:ext uri="{5AE41FA2-C0FF-4470-9BD4-5FADCA87CBE2}">
-                    <aclsh:classification xmlns:aclsh="http://schemas.microsoft.com/office/drawing/2020/classificationShape" classificationOutcomeType="hdr"/>
-                  </a:ext>
-                </a:extLst>
-              </wp:docPr>
-              <wp:cNvGraphicFramePr/>
-              <a:graphic xmlns:a="http://schemas.openxmlformats.org/drawingml/2006/main">
-                <a:graphicData uri="http://schemas.microsoft.com/office/word/2010/wordprocessingShape">
-                  <wps:wsp>
-                    <wps:cNvSpPr txBox="1"/>
-                    <wps:spPr>
-                      <a:xfrm>
-                        <a:off x="0" y="0"/>
-                        <a:ext cx="282575" cy="325755"/>
-                      </a:xfrm>
-                      <a:prstGeom prst="rect">
-                        <a:avLst/>
-                      </a:prstGeom>
-                      <a:noFill/>
-                      <a:ln>
-                        <a:noFill/>
-                      </a:ln>
-                    </wps:spPr>
-                    <wps:txbx>
-                      <w:txbxContent>
-                        <w:p>
-                          <w:pPr>
-                            <w:spacing w:after="0"/>
-                            <w:rPr>
-                              <w:rFonts w:ascii="Arial" w:eastAsia="Arial" w:hAnsi="Arial" w:cs="Arial"/>
-                              <w:noProof/>
-                              <w:color w:val="000000"/>
-                              <w:sz w:val="16"/>
-                              <w:szCs w:val="16"/>
-                            </w:rPr>
-                          </w:pPr>
-                          <w:r>
-                            <w:rPr>
-                              <w:rFonts w:ascii="Arial" w:eastAsia="Arial" w:hAnsi="Arial" w:cs="Arial"/>
-                              <w:noProof/>
-                              <w:color w:val="000000"/>
-                              <w:sz w:val="16"/>
-                              <w:szCs w:val="16"/>
-                            </w:rPr>
-                            <w:t xml:space="preserve"> </w:t>
-                          </w:r>
-                        </w:p>
-                      </w:txbxContent>
-                    </wps:txbx>
-                    <wps:bodyPr rot="0" spcFirstLastPara="0" vertOverflow="overflow" horzOverflow="overflow" vert="horz" wrap="none" lIns="254000" tIns="190500" rIns="0" bIns="0" numCol="1" spcCol="0" rtlCol="0" fromWordArt="0" anchor="t" anchorCtr="0" forceAA="0" compatLnSpc="1">
-                      <a:prstTxWarp prst="textNoShape">
-                        <a:avLst/>
-                      </a:prstTxWarp>
-                      <a:spAutoFit/>
-                    </wps:bodyPr>
-                  </wps:wsp>
-                </a:graphicData>
-              </a:graphic>
-            </wp:anchor>
-          </w:drawing>
-        </mc:Choice>
-        <mc:Fallback>
-          <w:pict>
-            <v:shapetype w14:anchorId="4DD21ED1" id="_x0000_t202" coordsize="21600,21600" o:spt="202" path="m,l,21600r21600,l21600,xe">
-              <v:stroke joinstyle="miter"/>
-              <v:path gradientshapeok="t" o:connecttype="rect"/>
-            </v:shapetype>
-            <v:shape id="Text Box 3" o:spid="_x0000_s1027" type="#_x0000_t202" alt=" " style="position:absolute;margin-left:0;margin-top:0;width:22.25pt;height:25.65pt;z-index:251660288;visibility:visible;mso-wrap-style:none;mso-wrap-distance-left:0;mso-wrap-distance-top:0;mso-wrap-distance-right:0;mso-wrap-distance-bottom:0;mso-position-horizontal:left;mso-position-horizontal-relative:page;mso-position-vertical:top;mso-position-vertical-relative:page;v-text-anchor:top" o:gfxdata="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" filled="f" stroked="f">
-              <v:fill o:detectmouseclick="t"/>
-              <v:textbox style="mso-fit-shape-to-text:t" inset="20pt,15pt,0,0">
-                <w:txbxContent>
-                  <w:p>
-                    <w:pPr>
-                      <w:spacing w:after="0"/>
-                      <w:rPr>
-                        <w:rFonts w:ascii="Arial" w:eastAsia="Arial" w:hAnsi="Arial" w:cs="Arial"/>
-                        <w:noProof/>
-                        <w:color w:val="000000"/>
-                        <w:sz w:val="16"/>
-                        <w:szCs w:val="16"/>
-                      </w:rPr>
-                    </w:pPr>
-                    <w:r>
-                      <w:rPr>
-                        <w:rFonts w:ascii="Arial" w:eastAsia="Arial" w:hAnsi="Arial" w:cs="Arial"/>
-                        <w:noProof/>
-                        <w:color w:val="000000"/>
-                        <w:sz w:val="16"/>
-                        <w:szCs w:val="16"/>
-                      </w:rPr>
-                      <w:t xml:space="preserve"> </w:t>
-                    </w:r>
-                  </w:p>
-                </w:txbxContent>
-              </v:textbox>
-              <w10:wrap anchorx="page" anchory="page"/>
-            </v:shape>
-          </w:pict>
-        </mc:Fallback>
-      </mc:AlternateContent>
-    </w:r>
   </w:p>
 </w:hdr>
 </file>
@@ -346,129 +568,12 @@
     <w:pPr>
       <w:pStyle w:val="Header"/>
     </w:pPr>
-    <w:r>
-      <w:rPr>
-        <w:noProof/>
-      </w:rPr>
-      <mc:AlternateContent>
-        <mc:Choice Requires="wps">
-          <w:drawing>
-            <wp:anchor distT="0" distB="0" distL="0" distR="0" simplePos="0" relativeHeight="251658240" behindDoc="0" locked="0" layoutInCell="1" allowOverlap="1" wp14:anchorId="3DB20BFD" wp14:editId="6533BDA5">
-              <wp:simplePos x="635" y="635"/>
-              <wp:positionH relativeFrom="page">
-                <wp:align>left</wp:align>
-              </wp:positionH>
-              <wp:positionV relativeFrom="page">
-                <wp:align>top</wp:align>
-              </wp:positionV>
-              <wp:extent cx="282575" cy="325755"/>
-              <wp:effectExtent l="0" t="0" r="3175" b="17145"/>
-              <wp:wrapNone/>
-              <wp:docPr id="1575553109" name="Text Box 1" descr=" ">
-                <a:extLst xmlns:a="http://schemas.openxmlformats.org/drawingml/2006/main">
-                  <a:ext uri="{5AE41FA2-C0FF-4470-9BD4-5FADCA87CBE2}">
-                    <aclsh:classification xmlns:aclsh="http://schemas.microsoft.com/office/drawing/2020/classificationShape" classificationOutcomeType="hdr"/>
-                  </a:ext>
-                </a:extLst>
-              </wp:docPr>
-              <wp:cNvGraphicFramePr/>
-              <a:graphic xmlns:a="http://schemas.openxmlformats.org/drawingml/2006/main">
-                <a:graphicData uri="http://schemas.microsoft.com/office/word/2010/wordprocessingShape">
-                  <wps:wsp>
-                    <wps:cNvSpPr txBox="1"/>
-                    <wps:spPr>
-                      <a:xfrm>
-                        <a:off x="0" y="0"/>
-                        <a:ext cx="282575" cy="325755"/>
-                      </a:xfrm>
-                      <a:prstGeom prst="rect">
-                        <a:avLst/>
-                      </a:prstGeom>
-                      <a:noFill/>
-                      <a:ln>
-                        <a:noFill/>
-                      </a:ln>
-                    </wps:spPr>
-                    <wps:txbx>
-                      <w:txbxContent>
-                        <w:p>
-                          <w:pPr>
-                            <w:spacing w:after="0"/>
-                            <w:rPr>
-                              <w:rFonts w:ascii="Arial" w:eastAsia="Arial" w:hAnsi="Arial" w:cs="Arial"/>
-                              <w:noProof/>
-                              <w:color w:val="000000"/>
-                              <w:sz w:val="16"/>
-                              <w:szCs w:val="16"/>
-                            </w:rPr>
-                          </w:pPr>
-                          <w:r>
-                            <w:rPr>
-                              <w:rFonts w:ascii="Arial" w:eastAsia="Arial" w:hAnsi="Arial" w:cs="Arial"/>
-                              <w:noProof/>
-                              <w:color w:val="000000"/>
-                              <w:sz w:val="16"/>
-                              <w:szCs w:val="16"/>
-                            </w:rPr>
-                            <w:t xml:space="preserve"> </w:t>
-                          </w:r>
-                        </w:p>
-                      </w:txbxContent>
-                    </wps:txbx>
-                    <wps:bodyPr rot="0" spcFirstLastPara="0" vertOverflow="overflow" horzOverflow="overflow" vert="horz" wrap="none" lIns="254000" tIns="190500" rIns="0" bIns="0" numCol="1" spcCol="0" rtlCol="0" fromWordArt="0" anchor="t" anchorCtr="0" forceAA="0" compatLnSpc="1">
-                      <a:prstTxWarp prst="textNoShape">
-                        <a:avLst/>
-                      </a:prstTxWarp>
-                      <a:spAutoFit/>
-                    </wps:bodyPr>
-                  </wps:wsp>
-                </a:graphicData>
-              </a:graphic>
-            </wp:anchor>
-          </w:drawing>
-        </mc:Choice>
-        <mc:Fallback>
-          <w:pict>
-            <v:shapetype w14:anchorId="3DB20BFD" id="_x0000_t202" coordsize="21600,21600" o:spt="202" path="m,l,21600r21600,l21600,xe">
-              <v:stroke joinstyle="miter"/>
-              <v:path gradientshapeok="t" o:connecttype="rect"/>
-            </v:shapetype>
-            <v:shape id="Text Box 1" o:spid="_x0000_s1028" type="#_x0000_t202" alt=" " style="position:absolute;margin-left:0;margin-top:0;width:22.25pt;height:25.65pt;z-index:251658240;visibility:visible;mso-wrap-style:none;mso-wrap-distance-left:0;mso-wrap-distance-top:0;mso-wrap-distance-right:0;mso-wrap-distance-bottom:0;mso-position-horizontal:left;mso-position-horizontal-relative:page;mso-position-vertical:top;mso-position-vertical-relative:page;v-text-anchor:top" o:gfxdata="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" filled="f" stroked="f">
-              <v:fill o:detectmouseclick="t"/>
-              <v:textbox style="mso-fit-shape-to-text:t" inset="20pt,15pt,0,0">
-                <w:txbxContent>
-                  <w:p>
-                    <w:pPr>
-                      <w:spacing w:after="0"/>
-                      <w:rPr>
-                        <w:rFonts w:ascii="Arial" w:eastAsia="Arial" w:hAnsi="Arial" w:cs="Arial"/>
-                        <w:noProof/>
-                        <w:color w:val="000000"/>
-                        <w:sz w:val="16"/>
-                        <w:szCs w:val="16"/>
-                      </w:rPr>
-                    </w:pPr>
-                    <w:r>
-                      <w:rPr>
-                        <w:rFonts w:ascii="Arial" w:eastAsia="Arial" w:hAnsi="Arial" w:cs="Arial"/>
-                        <w:noProof/>
-                        <w:color w:val="000000"/>
-                        <w:sz w:val="16"/>
-                        <w:szCs w:val="16"/>
-                      </w:rPr>
-                      <w:t xml:space="preserve"> </w:t>
-                    </w:r>
-                  </w:p>
-                </w:txbxContent>
-              </v:textbox>
-              <w10:wrap anchorx="page" anchory="page"/>
-            </v:shape>
-          </w:pict>
-        </mc:Fallback>
-      </mc:AlternateContent>
-    </w:r>
   </w:p>
 </w:hdr>
+</file>
+
+<file path=word/numbering.xml><?xml version="1.0" encoding="utf-8"?>
+<w:numbering xmlns:wpc="http://schemas.microsoft.com/office/word/2010/wordprocessingCanvas" xmlns:cx="http://schemas.microsoft.com/office/drawing/2014/chartex" xmlns:cx1="http://schemas.microsoft.com/office/drawing/2015/9/8/chartex" xmlns:cx2="http://schemas.microsoft.com/office/drawing/2015/10/21/chartex" xmlns:cx3="http://schemas.microsoft.com/office/drawing/2016/5/9/chartex" xmlns:cx4="http://schemas.microsoft.com/office/drawing/2016/5/10/chartex" xmlns:cx5="http://schemas.microsoft.com/office/drawing/2016/5/11/chartex" xmlns:cx6="http://schemas.microsoft.com/office/drawing/2016/5/12/chartex" xmlns:cx7="http://schemas.microsoft.com/office/drawing/2016/5/13/chartex" xmlns:cx8="http://schemas.microsoft.com/office/drawing/2016/5/14/chartex" xmlns:mc="http://schemas.openxmlformats.org/markup-compatibility/2006" xmlns:aink="http://schemas.microsoft.com/office/drawing/2016/ink" xmlns:am3d="http://schemas.microsoft.com/office/drawing/2017/model3d" xmlns:o="urn:schemas-microsoft-com:office:office" xmlns:oel="http://schemas.microsoft.com/office/2019/extlst" xmlns:r="http://schemas.openxmlformats.org/officeDocument/2006/relationships" xmlns:m="http://schemas.openxmlformats.org/officeDocument/2006/math" xmlns:v="urn:schemas-microsoft-com:vml" xmlns:wp14="http://schemas.microsoft.com/office/word/2010/wordprocessingDrawing" xmlns:wp="http://schemas.openxmlformats.org/drawingml/2006/wordprocessingDrawing" xmlns:w10="urn:schemas-microsoft-com:office:word" xmlns:w="http://schemas.openxmlformats.org/wordprocessingml/2006/main" xmlns:w14="http://schemas.microsoft.com/office/word/2010/wordml" xmlns:w15="http://schemas.microsoft.com/office/word/2012/wordml" xmlns:w16cex="http://schemas.microsoft.com/office/word/2018/wordml/cex" xmlns:w16cid="http://schemas.microsoft.com/office/word/2016/wordml/cid" xmlns:w16="http://schemas.microsoft.com/office/word/2018/wordml" xmlns:w16du="http://schemas.microsoft.com/office/word/2023/wordml/word16du" xmlns:w16sdtdh="http://schemas.microsoft.com/office/word/2020/wordml/sdtdatahash" xmlns:w16sdtfl="http://schemas.microsoft.com/office/word/2024/wordml/sdtformatlock" xmlns:w16se="http://schemas.microsoft.com/office/word/2015/wordml/symex" xmlns:wpg="http://schemas.microsoft.com/office/word/2010/wordprocessingGroup" xmlns:wpi="http://schemas.microsoft.com/office/word/2010/wordprocessingInk" xmlns:wne="http://schemas.microsoft.com/office/word/2006/wordml" xmlns:wps="http://schemas.microsoft.com/office/word/2010/wordprocessingShape" mc:Ignorable="w14 w15 w16se w16cid w16 w16cex w16sdtdh w16sdtfl w16du wp14"/>
 </file>
 
 <file path=word/styles.xml><?xml version="1.0" encoding="utf-8"?>
@@ -1410,6 +1515,51 @@
     <w:uiPriority w:val="99"/>
     <w:rsid w:val="00837452"/>
   </w:style>
+  <w:style w:type="paragraph" w:styleId="Footer">
+    <w:name w:val="footer"/>
+    <w:basedOn w:val="Normal"/>
+    <w:link w:val="FooterChar"/>
+    <w:uiPriority w:val="99"/>
+    <w:unhideWhenUsed/>
+    <w:rsid w:val="001F7C6D"/>
+    <w:pPr>
+      <w:tabs>
+        <w:tab w:val="center" w:pos="4513"/>
+        <w:tab w:val="right" w:pos="9026"/>
+      </w:tabs>
+      <w:spacing w:after="0" w:line="240" w:lineRule="auto"/>
+    </w:pPr>
+  </w:style>
+  <w:style w:type="character" w:customStyle="1" w:styleId="FooterChar">
+    <w:name w:val="Footer Char"/>
+    <w:basedOn w:val="DefaultParagraphFont"/>
+    <w:link w:val="Footer"/>
+    <w:uiPriority w:val="99"/>
+    <w:rsid w:val="001F7C6D"/>
+  </w:style>
+  <w:style w:type="character" w:styleId="Hyperlink">
+    <w:name w:val="Hyperlink"/>
+    <w:basedOn w:val="DefaultParagraphFont"/>
+    <w:uiPriority w:val="99"/>
+    <w:unhideWhenUsed/>
+    <w:rsid w:val="001F7C6D"/>
+    <w:rPr>
+      <w:color w:val="467886" w:themeColor="hyperlink"/>
+      <w:u w:val="single"/>
+    </w:rPr>
+  </w:style>
+  <w:style w:type="character" w:styleId="UnresolvedMention">
+    <w:name w:val="Unresolved Mention"/>
+    <w:basedOn w:val="DefaultParagraphFont"/>
+    <w:uiPriority w:val="99"/>
+    <w:semiHidden/>
+    <w:unhideWhenUsed/>
+    <w:rsid w:val="001F7C6D"/>
+    <w:rPr>
+      <w:color w:val="605E5C"/>
+      <w:shd w:val="clear" w:color="auto" w:fill="E1DFDD"/>
+    </w:rPr>
+  </w:style>
 </w:styles>
 </file>
 
@@ -1730,6 +1880,6 @@
 
 <file path=docMetadata/LabelInfo.xml><?xml version="1.0" encoding="utf-8"?>
 <clbl:labelList xmlns:clbl="http://schemas.microsoft.com/office/2020/mipLabelMetadata">
-  <clbl:label id="{b9fec68c-c92d-461e-9a97-3d03a0f18b82}" enabled="0" method="" siteId="{b9fec68c-c92d-461e-9a97-3d03a0f18b82}" removed="1"/>
+  <clbl:label id="{4af293e6-3850-4258-b2c7-0aa0e3bfa7d9}" enabled="1" method="Privileged" siteId="{b9fec68c-c92d-461e-9a97-3d03a0f18b82}" removed="0"/>
 </clbl:labelList>
 </file>
</xml_diff>